<commit_message>
feat(so): update template files
</commit_message>
<xml_diff>
--- a/document-merge-service/kt_so/templatefiles/bab-uebergabeformular-baugesuch.docx
+++ b/document-merge-service/kt_so/templatefiles/bab-uebergabeformular-baugesuch.docx
@@ -1,6 +1,6 @@
 
 <file path=word/document.xml><?xml version="1.0" encoding="utf-8"?>
-<w:document xmlns:wpc="http://schemas.microsoft.com/office/word/2010/wordprocessingCanvas" xmlns:cx="http://schemas.microsoft.com/office/drawing/2014/chartex" xmlns:cx1="http://schemas.microsoft.com/office/drawing/2015/9/8/chartex" xmlns:cx2="http://schemas.microsoft.com/office/drawing/2015/10/21/chartex" xmlns:cx3="http://schemas.microsoft.com/office/drawing/2016/5/9/chartex" xmlns:cx4="http://schemas.microsoft.com/office/drawing/2016/5/10/chartex" xmlns:cx5="http://schemas.microsoft.com/office/drawing/2016/5/11/chartex" xmlns:cx6="http://schemas.microsoft.com/office/drawing/2016/5/12/chartex" xmlns:cx7="http://schemas.microsoft.com/office/drawing/2016/5/13/chartex" xmlns:cx8="http://schemas.microsoft.com/office/drawing/2016/5/14/chartex" xmlns:mc="http://schemas.openxmlformats.org/markup-compatibility/2006" xmlns:aink="http://schemas.microsoft.com/office/drawing/2016/ink" xmlns:am3d="http://schemas.microsoft.com/office/drawing/2017/model3d" xmlns:o="urn:schemas-microsoft-com:office:office" xmlns:oel="http://schemas.microsoft.com/office/2019/extlst" xmlns:r="http://schemas.openxmlformats.org/officeDocument/2006/relationships" xmlns:m="http://schemas.openxmlformats.org/officeDocument/2006/math" xmlns:v="urn:schemas-microsoft-com:vml" xmlns:wp14="http://schemas.microsoft.com/office/word/2010/wordprocessingDrawing" xmlns:wp="http://schemas.openxmlformats.org/drawingml/2006/wordprocessingDrawing" xmlns:w10="urn:schemas-microsoft-com:office:word" xmlns:w="http://schemas.openxmlformats.org/wordprocessingml/2006/main" xmlns:w14="http://schemas.microsoft.com/office/word/2010/wordml" xmlns:w15="http://schemas.microsoft.com/office/word/2012/wordml" xmlns:w16cex="http://schemas.microsoft.com/office/word/2018/wordml/cex" xmlns:w16cid="http://schemas.microsoft.com/office/word/2016/wordml/cid" xmlns:w16="http://schemas.microsoft.com/office/word/2018/wordml" xmlns:w16du="http://schemas.microsoft.com/office/word/2023/wordml/word16du" xmlns:w16sdtdh="http://schemas.microsoft.com/office/word/2020/wordml/sdtdatahash" xmlns:w16se="http://schemas.microsoft.com/office/word/2015/wordml/symex" xmlns:wpg="http://schemas.microsoft.com/office/word/2010/wordprocessingGroup" xmlns:wpi="http://schemas.microsoft.com/office/word/2010/wordprocessingInk" xmlns:wne="http://schemas.microsoft.com/office/word/2006/wordml" xmlns:wps="http://schemas.microsoft.com/office/word/2010/wordprocessingShape" mc:Ignorable="w14 w15 w16se w16cid w16 w16cex w16sdtdh w16du wp14">
+<w:document xmlns:wpc="http://schemas.microsoft.com/office/word/2010/wordprocessingCanvas" xmlns:cx="http://schemas.microsoft.com/office/drawing/2014/chartex" xmlns:cx1="http://schemas.microsoft.com/office/drawing/2015/9/8/chartex" xmlns:cx2="http://schemas.microsoft.com/office/drawing/2015/10/21/chartex" xmlns:cx3="http://schemas.microsoft.com/office/drawing/2016/5/9/chartex" xmlns:cx4="http://schemas.microsoft.com/office/drawing/2016/5/10/chartex" xmlns:cx5="http://schemas.microsoft.com/office/drawing/2016/5/11/chartex" xmlns:cx6="http://schemas.microsoft.com/office/drawing/2016/5/12/chartex" xmlns:cx7="http://schemas.microsoft.com/office/drawing/2016/5/13/chartex" xmlns:cx8="http://schemas.microsoft.com/office/drawing/2016/5/14/chartex" xmlns:mc="http://schemas.openxmlformats.org/markup-compatibility/2006" xmlns:aink="http://schemas.microsoft.com/office/drawing/2016/ink" xmlns:am3d="http://schemas.microsoft.com/office/drawing/2017/model3d" xmlns:o="urn:schemas-microsoft-com:office:office" xmlns:oel="http://schemas.microsoft.com/office/2019/extlst" xmlns:r="http://schemas.openxmlformats.org/officeDocument/2006/relationships" xmlns:m="http://schemas.openxmlformats.org/officeDocument/2006/math" xmlns:v="urn:schemas-microsoft-com:vml" xmlns:wp14="http://schemas.microsoft.com/office/word/2010/wordprocessingDrawing" xmlns:wp="http://schemas.openxmlformats.org/drawingml/2006/wordprocessingDrawing" xmlns:w10="urn:schemas-microsoft-com:office:word" xmlns:w="http://schemas.openxmlformats.org/wordprocessingml/2006/main" xmlns:w14="http://schemas.microsoft.com/office/word/2010/wordml" xmlns:w15="http://schemas.microsoft.com/office/word/2012/wordml" xmlns:w16cex="http://schemas.microsoft.com/office/word/2018/wordml/cex" xmlns:w16cid="http://schemas.microsoft.com/office/word/2016/wordml/cid" xmlns:w16="http://schemas.microsoft.com/office/word/2018/wordml" xmlns:w16du="http://schemas.microsoft.com/office/word/2023/wordml/word16du" xmlns:w16sdtdh="http://schemas.microsoft.com/office/word/2020/wordml/sdtdatahash" xmlns:w16sdtfl="http://schemas.microsoft.com/office/word/2024/wordml/sdtformatlock" xmlns:w16se="http://schemas.microsoft.com/office/word/2015/wordml/symex" xmlns:wpg="http://schemas.microsoft.com/office/word/2010/wordprocessingGroup" xmlns:wpi="http://schemas.microsoft.com/office/word/2010/wordprocessingInk" xmlns:wne="http://schemas.microsoft.com/office/word/2006/wordml" xmlns:wps="http://schemas.microsoft.com/office/word/2010/wordprocessingShape" mc:Ignorable="w14 w15 w16se w16cid w16 w16cex w16sdtdh w16sdtfl w16du wp14">
   <w:body>
     <w:p>
       <w:pPr>
@@ -144,7 +144,6 @@
         <w:tc>
           <w:tcPr>
             <w:tcW w:w="1985" w:type="dxa"/>
-            <w:shd w:val="clear" w:color="auto" w:fill="auto"/>
           </w:tcPr>
           <w:p>
             <w:pPr>
@@ -166,7 +165,6 @@
         <w:tc>
           <w:tcPr>
             <w:tcW w:w="7515" w:type="dxa"/>
-            <w:shd w:val="clear" w:color="auto" w:fill="auto"/>
           </w:tcPr>
           <w:p>
             <w:pPr>
@@ -199,7 +197,6 @@
         <w:tc>
           <w:tcPr>
             <w:tcW w:w="1985" w:type="dxa"/>
-            <w:shd w:val="clear" w:color="auto" w:fill="auto"/>
           </w:tcPr>
           <w:p>
             <w:pPr>
@@ -221,7 +218,6 @@
         <w:tc>
           <w:tcPr>
             <w:tcW w:w="7515" w:type="dxa"/>
-            <w:shd w:val="clear" w:color="auto" w:fill="auto"/>
           </w:tcPr>
           <w:p>
             <w:pPr>
@@ -254,7 +250,6 @@
         <w:tc>
           <w:tcPr>
             <w:tcW w:w="1985" w:type="dxa"/>
-            <w:shd w:val="clear" w:color="auto" w:fill="auto"/>
           </w:tcPr>
           <w:p>
             <w:pPr>
@@ -276,7 +271,6 @@
         <w:tc>
           <w:tcPr>
             <w:tcW w:w="7515" w:type="dxa"/>
-            <w:shd w:val="clear" w:color="auto" w:fill="auto"/>
           </w:tcPr>
           <w:p>
             <w:pPr>
@@ -300,7 +294,23 @@
                 <w:sz w:val="18"/>
                 <w:szCs w:val="18"/>
               </w:rPr>
-              <w:t xml:space="preserve"> }}{% </w:t>
+              <w:t xml:space="preserve"> </w:t>
+            </w:r>
+            <w:proofErr w:type="gramStart"/>
+            <w:r>
+              <w:rPr>
+                <w:sz w:val="18"/>
+                <w:szCs w:val="18"/>
+              </w:rPr>
+              <w:t>}}{</w:t>
+            </w:r>
+            <w:proofErr w:type="gramEnd"/>
+            <w:r>
+              <w:rPr>
+                <w:sz w:val="18"/>
+                <w:szCs w:val="18"/>
+              </w:rPr>
+              <w:t xml:space="preserve">% </w:t>
             </w:r>
             <w:proofErr w:type="spellStart"/>
             <w:r>
@@ -316,7 +326,55 @@
                 <w:sz w:val="18"/>
                 <w:szCs w:val="18"/>
               </w:rPr>
-              <w:t xml:space="preserve"> GEMEINDE != GEMEINDE_ORT %}, Ortsteil {{ GEMEINDE_ORT }}{% </w:t>
+              <w:t xml:space="preserve"> </w:t>
+            </w:r>
+            <w:proofErr w:type="gramStart"/>
+            <w:r>
+              <w:rPr>
+                <w:sz w:val="18"/>
+                <w:szCs w:val="18"/>
+              </w:rPr>
+              <w:t>GEMEINDE !</w:t>
+            </w:r>
+            <w:proofErr w:type="gramEnd"/>
+            <w:r>
+              <w:rPr>
+                <w:sz w:val="18"/>
+                <w:szCs w:val="18"/>
+              </w:rPr>
+              <w:t xml:space="preserve">= GEMEINDE_ORT %}, Ortsteil </w:t>
+            </w:r>
+            <w:proofErr w:type="gramStart"/>
+            <w:r>
+              <w:rPr>
+                <w:sz w:val="18"/>
+                <w:szCs w:val="18"/>
+              </w:rPr>
+              <w:t>{{ GEMEINDE</w:t>
+            </w:r>
+            <w:proofErr w:type="gramEnd"/>
+            <w:r>
+              <w:rPr>
+                <w:sz w:val="18"/>
+                <w:szCs w:val="18"/>
+              </w:rPr>
+              <w:t>_</w:t>
+            </w:r>
+            <w:proofErr w:type="gramStart"/>
+            <w:r>
+              <w:rPr>
+                <w:sz w:val="18"/>
+                <w:szCs w:val="18"/>
+              </w:rPr>
+              <w:t>ORT }}{</w:t>
+            </w:r>
+            <w:proofErr w:type="gramEnd"/>
+            <w:r>
+              <w:rPr>
+                <w:sz w:val="18"/>
+                <w:szCs w:val="18"/>
+              </w:rPr>
+              <w:t xml:space="preserve">% </w:t>
             </w:r>
             <w:proofErr w:type="spellStart"/>
             <w:r>
@@ -341,7 +399,6 @@
         <w:tc>
           <w:tcPr>
             <w:tcW w:w="1985" w:type="dxa"/>
-            <w:shd w:val="clear" w:color="auto" w:fill="auto"/>
           </w:tcPr>
           <w:p>
             <w:pPr>
@@ -379,7 +436,6 @@
         <w:tc>
           <w:tcPr>
             <w:tcW w:w="7515" w:type="dxa"/>
-            <w:shd w:val="clear" w:color="auto" w:fill="auto"/>
           </w:tcPr>
           <w:p>
             <w:pPr>
@@ -1550,7 +1606,23 @@
                 <w:sz w:val="18"/>
                 <w:szCs w:val="18"/>
               </w:rPr>
-              <w:t xml:space="preserve"> bis </w:t>
+              <w:t xml:space="preserve"> </w:t>
+            </w:r>
+            <w:proofErr w:type="spellStart"/>
+            <w:r>
+              <w:rPr>
+                <w:sz w:val="18"/>
+                <w:szCs w:val="18"/>
+              </w:rPr>
+              <w:t>bis</w:t>
+            </w:r>
+            <w:proofErr w:type="spellEnd"/>
+            <w:r>
+              <w:rPr>
+                <w:sz w:val="18"/>
+                <w:szCs w:val="18"/>
+              </w:rPr>
+              <w:t xml:space="preserve"> </w:t>
             </w:r>
             <w:r>
               <w:rPr>
@@ -2055,25 +2127,7 @@
                 <w:sz w:val="12"/>
                 <w:szCs w:val="12"/>
               </w:rPr>
-              <w:t xml:space="preserve">muss in </w:t>
-            </w:r>
-            <w:proofErr w:type="spellStart"/>
-            <w:r>
-              <w:rPr>
-                <w:i/>
-                <w:sz w:val="12"/>
-                <w:szCs w:val="12"/>
-              </w:rPr>
-              <w:t>eBau</w:t>
-            </w:r>
-            <w:proofErr w:type="spellEnd"/>
-            <w:r>
-              <w:rPr>
-                <w:i/>
-                <w:sz w:val="12"/>
-                <w:szCs w:val="12"/>
-              </w:rPr>
-              <w:t xml:space="preserve"> einsehbar sein</w:t>
+              <w:t>muss in eBau einsehbar sein</w:t>
             </w:r>
             <w:r>
               <w:rPr>
@@ -2333,25 +2387,7 @@
                 <w:sz w:val="14"/>
                 <w:szCs w:val="14"/>
               </w:rPr>
-              <w:t xml:space="preserve">in </w:t>
-            </w:r>
-            <w:proofErr w:type="spellStart"/>
-            <w:r>
-              <w:rPr>
-                <w:i/>
-                <w:sz w:val="14"/>
-                <w:szCs w:val="14"/>
-              </w:rPr>
-              <w:t>eBau</w:t>
-            </w:r>
-            <w:proofErr w:type="spellEnd"/>
-            <w:r>
-              <w:rPr>
-                <w:i/>
-                <w:sz w:val="14"/>
-                <w:szCs w:val="14"/>
-              </w:rPr>
-              <w:t xml:space="preserve"> </w:t>
+              <w:t xml:space="preserve">in eBau </w:t>
             </w:r>
             <w:r>
               <w:rPr>
@@ -2400,7 +2436,6 @@
         <w:tc>
           <w:tcPr>
             <w:tcW w:w="1985" w:type="dxa"/>
-            <w:shd w:val="clear" w:color="auto" w:fill="auto"/>
           </w:tcPr>
           <w:p>
             <w:pPr>
@@ -2432,7 +2467,6 @@
         <w:tc>
           <w:tcPr>
             <w:tcW w:w="7520" w:type="dxa"/>
-            <w:shd w:val="clear" w:color="auto" w:fill="auto"/>
           </w:tcPr>
           <w:p>
             <w:pPr>
@@ -3152,7 +3186,6 @@
         <w:tc>
           <w:tcPr>
             <w:tcW w:w="1985" w:type="dxa"/>
-            <w:shd w:val="clear" w:color="auto" w:fill="auto"/>
           </w:tcPr>
           <w:p>
             <w:pPr>
@@ -3176,7 +3209,6 @@
         <w:tc>
           <w:tcPr>
             <w:tcW w:w="7520" w:type="dxa"/>
-            <w:shd w:val="clear" w:color="auto" w:fill="auto"/>
           </w:tcPr>
           <w:p>
             <w:pPr>
@@ -3235,23 +3267,7 @@
                 <w:sz w:val="18"/>
                 <w:szCs w:val="18"/>
               </w:rPr>
-              <w:t xml:space="preserve"> Ist das rechtliche Gehör abgeschlossen und sind sämtliche Korrespondenzen dazu in </w:t>
-            </w:r>
-            <w:proofErr w:type="spellStart"/>
-            <w:r>
-              <w:rPr>
-                <w:sz w:val="18"/>
-                <w:szCs w:val="18"/>
-              </w:rPr>
-              <w:t>eBau</w:t>
-            </w:r>
-            <w:proofErr w:type="spellEnd"/>
-            <w:r>
-              <w:rPr>
-                <w:sz w:val="18"/>
-                <w:szCs w:val="18"/>
-              </w:rPr>
-              <w:t xml:space="preserve"> einsehbar?</w:t>
+              <w:t xml:space="preserve"> Ist das rechtliche Gehör abgeschlossen und sind sämtliche Korrespondenzen dazu in eBau einsehbar?</w:t>
             </w:r>
           </w:p>
           <w:p>
@@ -3460,7 +3476,25 @@
                 <w:sz w:val="14"/>
                 <w:szCs w:val="14"/>
               </w:rPr>
-              <w:t>Falls mindestens eine Frage mit nein beantwortet werden muss, haben die Baugesuchsunterlagen noch nicht den Stand, dass diese zur kantonalen Prüfung weitergeleitet werden können (Pendenz Baubehörde / Bauherrschaft).</w:t>
+              <w:t xml:space="preserve">Falls mindestens eine Frage mit nein beantwortet werden muss, haben die </w:t>
+            </w:r>
+            <w:proofErr w:type="spellStart"/>
+            <w:r>
+              <w:rPr>
+                <w:i/>
+                <w:sz w:val="14"/>
+                <w:szCs w:val="14"/>
+              </w:rPr>
+              <w:t>Baugesuchsunterlagen</w:t>
+            </w:r>
+            <w:proofErr w:type="spellEnd"/>
+            <w:r>
+              <w:rPr>
+                <w:i/>
+                <w:sz w:val="14"/>
+                <w:szCs w:val="14"/>
+              </w:rPr>
+              <w:t xml:space="preserve"> noch nicht den Stand, dass diese zur kantonalen Prüfung weitergeleitet werden können (Pendenz Baubehörde / Bauherrschaft).</w:t>
             </w:r>
           </w:p>
         </w:tc>
@@ -3469,7 +3503,6 @@
         <w:tc>
           <w:tcPr>
             <w:tcW w:w="8500" w:type="dxa"/>
-            <w:shd w:val="clear" w:color="auto" w:fill="auto"/>
           </w:tcPr>
           <w:p>
             <w:pPr>
@@ -3485,7 +3518,23 @@
                 <w:sz w:val="18"/>
                 <w:szCs w:val="18"/>
               </w:rPr>
-              <w:t>Sind die Gesuchsunterlagen vollständig?</w:t>
+              <w:t xml:space="preserve">Sind die </w:t>
+            </w:r>
+            <w:proofErr w:type="spellStart"/>
+            <w:r>
+              <w:rPr>
+                <w:sz w:val="18"/>
+                <w:szCs w:val="18"/>
+              </w:rPr>
+              <w:t>Gesuchsunterlagen</w:t>
+            </w:r>
+            <w:proofErr w:type="spellEnd"/>
+            <w:r>
+              <w:rPr>
+                <w:sz w:val="18"/>
+                <w:szCs w:val="18"/>
+              </w:rPr>
+              <w:t xml:space="preserve"> vollständig?</w:t>
             </w:r>
           </w:p>
           <w:p>
@@ -3562,7 +3611,6 @@
         <w:tc>
           <w:tcPr>
             <w:tcW w:w="1005" w:type="dxa"/>
-            <w:shd w:val="clear" w:color="auto" w:fill="auto"/>
           </w:tcPr>
           <w:p>
             <w:sdt>
@@ -3643,7 +3691,6 @@
         <w:tc>
           <w:tcPr>
             <w:tcW w:w="8500" w:type="dxa"/>
-            <w:shd w:val="clear" w:color="auto" w:fill="auto"/>
           </w:tcPr>
           <w:p>
             <w:pPr>
@@ -3697,14 +3744,31 @@
                 <w:sz w:val="12"/>
                 <w:szCs w:val="12"/>
               </w:rPr>
-              <w:t>: Überarbeitung der Baugesuchsunterlagen (Rückweisung an Bauherrschaft)</w:t>
+              <w:t xml:space="preserve">: Überarbeitung der </w:t>
+            </w:r>
+            <w:proofErr w:type="spellStart"/>
+            <w:r>
+              <w:rPr>
+                <w:i/>
+                <w:sz w:val="12"/>
+                <w:szCs w:val="12"/>
+              </w:rPr>
+              <w:t>Baugesuchsunterlagen</w:t>
+            </w:r>
+            <w:proofErr w:type="spellEnd"/>
+            <w:r>
+              <w:rPr>
+                <w:i/>
+                <w:sz w:val="12"/>
+                <w:szCs w:val="12"/>
+              </w:rPr>
+              <w:t xml:space="preserve"> (Rückweisung an Bauherrschaft)</w:t>
             </w:r>
           </w:p>
         </w:tc>
         <w:tc>
           <w:tcPr>
             <w:tcW w:w="1005" w:type="dxa"/>
-            <w:shd w:val="clear" w:color="auto" w:fill="auto"/>
           </w:tcPr>
           <w:p>
             <w:sdt>
@@ -3785,7 +3849,6 @@
         <w:tc>
           <w:tcPr>
             <w:tcW w:w="8500" w:type="dxa"/>
-            <w:shd w:val="clear" w:color="auto" w:fill="auto"/>
           </w:tcPr>
           <w:p>
             <w:pPr>
@@ -3840,14 +3903,31 @@
                 <w:sz w:val="12"/>
                 <w:szCs w:val="12"/>
               </w:rPr>
-              <w:t>: Überarbeitung der Baugesuchsunterlagen (Rückweisung an Bauherrschaft)</w:t>
+              <w:t xml:space="preserve">: Überarbeitung der </w:t>
+            </w:r>
+            <w:proofErr w:type="spellStart"/>
+            <w:r>
+              <w:rPr>
+                <w:i/>
+                <w:sz w:val="12"/>
+                <w:szCs w:val="12"/>
+              </w:rPr>
+              <w:t>Baugesuchsunterlagen</w:t>
+            </w:r>
+            <w:proofErr w:type="spellEnd"/>
+            <w:r>
+              <w:rPr>
+                <w:i/>
+                <w:sz w:val="12"/>
+                <w:szCs w:val="12"/>
+              </w:rPr>
+              <w:t xml:space="preserve"> (Rückweisung an Bauherrschaft)</w:t>
             </w:r>
           </w:p>
         </w:tc>
         <w:tc>
           <w:tcPr>
             <w:tcW w:w="1005" w:type="dxa"/>
-            <w:shd w:val="clear" w:color="auto" w:fill="auto"/>
           </w:tcPr>
           <w:p>
             <w:pPr>
@@ -4002,7 +4082,6 @@
         <w:tc>
           <w:tcPr>
             <w:tcW w:w="8500" w:type="dxa"/>
-            <w:shd w:val="clear" w:color="auto" w:fill="auto"/>
           </w:tcPr>
           <w:p>
             <w:pPr>
@@ -4063,7 +4142,6 @@
         <w:tc>
           <w:tcPr>
             <w:tcW w:w="1005" w:type="dxa"/>
-            <w:shd w:val="clear" w:color="auto" w:fill="auto"/>
           </w:tcPr>
           <w:p>
             <w:pPr>
@@ -4428,212 +4506,6 @@
     <w:p>
       <w:pPr>
         <w:widowControl/>
-        <w:spacing w:line="259" w:lineRule="auto"/>
-        <w:rPr>
-          <w:szCs w:val="20"/>
-        </w:rPr>
-      </w:pPr>
-    </w:p>
-    <w:p>
-      <w:pPr>
-        <w:keepNext/>
-        <w:widowControl/>
-        <w:spacing w:before="120" w:line="259" w:lineRule="auto"/>
-        <w:rPr>
-          <w:szCs w:val="20"/>
-        </w:rPr>
-      </w:pPr>
-      <w:r>
-        <w:rPr>
-          <w:szCs w:val="20"/>
-        </w:rPr>
-        <w:t>Für die örtliche Baubehörde</w:t>
-      </w:r>
-      <w:r>
-        <w:rPr>
-          <w:szCs w:val="20"/>
-        </w:rPr>
-        <w:t xml:space="preserve"> </w:t>
-      </w:r>
-      <w:r>
-        <w:rPr>
-          <w:szCs w:val="20"/>
-        </w:rPr>
-        <w:t>bestätigt</w:t>
-      </w:r>
-      <w:r>
-        <w:rPr>
-          <w:szCs w:val="20"/>
-        </w:rPr>
-        <w:t xml:space="preserve"> </w:t>
-      </w:r>
-      <w:r>
-        <w:rPr>
-          <w:szCs w:val="20"/>
-        </w:rPr>
-        <w:t>d</w:t>
-      </w:r>
-      <w:r>
-        <w:rPr>
-          <w:szCs w:val="20"/>
-        </w:rPr>
-        <w:t>ie Richtigkeit der</w:t>
-      </w:r>
-      <w:r>
-        <w:rPr>
-          <w:szCs w:val="20"/>
-        </w:rPr>
-        <w:t xml:space="preserve"> vorgenannten Angaben</w:t>
-      </w:r>
-      <w:r>
-        <w:rPr>
-          <w:szCs w:val="20"/>
-        </w:rPr>
-        <w:t>:</w:t>
-      </w:r>
-    </w:p>
-    <w:tbl>
-      <w:tblPr>
-        <w:tblStyle w:val="Tabellenraster"/>
-        <w:tblW w:w="9498" w:type="dxa"/>
-        <w:tblLook w:val="04A0" w:firstRow="1" w:lastRow="0" w:firstColumn="1" w:lastColumn="0" w:noHBand="0" w:noVBand="1"/>
-      </w:tblPr>
-      <w:tblGrid>
-        <w:gridCol w:w="988"/>
-        <w:gridCol w:w="2556"/>
-        <w:gridCol w:w="2410"/>
-        <w:gridCol w:w="3544"/>
-      </w:tblGrid>
-      <w:tr>
-        <w:tc>
-          <w:tcPr>
-            <w:tcW w:w="988" w:type="dxa"/>
-            <w:tcBorders>
-              <w:top w:val="nil"/>
-              <w:left w:val="nil"/>
-              <w:bottom w:val="nil"/>
-              <w:right w:val="nil"/>
-            </w:tcBorders>
-          </w:tcPr>
-          <w:p>
-            <w:pPr>
-              <w:widowControl/>
-              <w:spacing w:before="360" w:line="259" w:lineRule="auto"/>
-              <w:ind w:left="-110"/>
-              <w:rPr>
-                <w:szCs w:val="20"/>
-              </w:rPr>
-            </w:pPr>
-            <w:r>
-              <w:rPr>
-                <w:szCs w:val="20"/>
-              </w:rPr>
-              <w:t>Datum:</w:t>
-            </w:r>
-          </w:p>
-        </w:tc>
-        <w:tc>
-          <w:tcPr>
-            <w:tcW w:w="2556" w:type="dxa"/>
-            <w:tcBorders>
-              <w:top w:val="nil"/>
-              <w:left w:val="nil"/>
-              <w:bottom w:val="dotted" w:sz="4" w:space="0" w:color="auto"/>
-              <w:right w:val="nil"/>
-            </w:tcBorders>
-          </w:tcPr>
-          <w:p>
-            <w:pPr>
-              <w:widowControl/>
-              <w:spacing w:before="360" w:line="259" w:lineRule="auto"/>
-              <w:rPr>
-                <w:szCs w:val="20"/>
-              </w:rPr>
-            </w:pPr>
-            <w:proofErr w:type="gramStart"/>
-            <w:r>
-              <w:rPr>
-                <w:sz w:val="18"/>
-                <w:szCs w:val="18"/>
-              </w:rPr>
-              <w:t>{{ HEUTE</w:t>
-            </w:r>
-            <w:proofErr w:type="gramEnd"/>
-            <w:r>
-              <w:rPr>
-                <w:sz w:val="18"/>
-                <w:szCs w:val="18"/>
-              </w:rPr>
-              <w:t xml:space="preserve"> }}</w:t>
-            </w:r>
-          </w:p>
-        </w:tc>
-        <w:tc>
-          <w:tcPr>
-            <w:tcW w:w="2410" w:type="dxa"/>
-            <w:tcBorders>
-              <w:top w:val="nil"/>
-              <w:left w:val="nil"/>
-              <w:bottom w:val="nil"/>
-              <w:right w:val="nil"/>
-            </w:tcBorders>
-          </w:tcPr>
-          <w:p>
-            <w:pPr>
-              <w:widowControl/>
-              <w:spacing w:before="360" w:line="259" w:lineRule="auto"/>
-              <w:rPr>
-                <w:szCs w:val="20"/>
-              </w:rPr>
-            </w:pPr>
-            <w:r>
-              <w:rPr>
-                <w:szCs w:val="20"/>
-              </w:rPr>
-              <w:t xml:space="preserve">Stempel / </w:t>
-            </w:r>
-            <w:r>
-              <w:rPr>
-                <w:szCs w:val="20"/>
-              </w:rPr>
-              <w:t>Unterschrift:</w:t>
-            </w:r>
-          </w:p>
-        </w:tc>
-        <w:tc>
-          <w:tcPr>
-            <w:tcW w:w="3544" w:type="dxa"/>
-            <w:tcBorders>
-              <w:top w:val="nil"/>
-              <w:left w:val="nil"/>
-              <w:bottom w:val="dotted" w:sz="4" w:space="0" w:color="auto"/>
-              <w:right w:val="nil"/>
-            </w:tcBorders>
-          </w:tcPr>
-          <w:p>
-            <w:pPr>
-              <w:widowControl/>
-              <w:spacing w:before="360" w:line="259" w:lineRule="auto"/>
-              <w:rPr>
-                <w:szCs w:val="20"/>
-              </w:rPr>
-            </w:pPr>
-          </w:p>
-        </w:tc>
-      </w:tr>
-    </w:tbl>
-    <w:p>
-      <w:pPr>
-        <w:widowControl/>
-        <w:rPr>
-          <w:sz w:val="2"/>
-          <w:szCs w:val="2"/>
-        </w:rPr>
-      </w:pPr>
-    </w:p>
-    <w:p>
-      <w:pPr>
-        <w:widowControl/>
         <w:spacing w:before="480" w:line="259" w:lineRule="auto"/>
         <w:rPr>
           <w:b/>
@@ -4672,21 +4544,7 @@
         <w:rPr>
           <w:szCs w:val="20"/>
         </w:rPr>
-        <w:t xml:space="preserve"> der Weiterleitung zur kantonalen Prüfung in </w:t>
-      </w:r>
-      <w:proofErr w:type="spellStart"/>
-      <w:r>
-        <w:rPr>
-          <w:szCs w:val="20"/>
-        </w:rPr>
-        <w:t>eBau</w:t>
-      </w:r>
-      <w:proofErr w:type="spellEnd"/>
-      <w:r>
-        <w:rPr>
-          <w:szCs w:val="20"/>
-        </w:rPr>
-        <w:t xml:space="preserve"> einsehbar sein:</w:t>
+        <w:t xml:space="preserve"> der Weiterleitung zur kantonalen Prüfung in eBau einsehbar sein:</w:t>
       </w:r>
     </w:p>
     <w:p>
@@ -7822,23 +7680,7 @@
           <w:sz w:val="14"/>
           <w:szCs w:val="14"/>
         </w:rPr>
-        <w:t xml:space="preserve">Diese Akten sind vollständig (d.h. mit sämtlichen Bewilligungen, Korrespondenzen und Planunterlagen) in </w:t>
-      </w:r>
-      <w:proofErr w:type="spellStart"/>
-      <w:r>
-        <w:rPr>
-          <w:sz w:val="14"/>
-          <w:szCs w:val="14"/>
-        </w:rPr>
-        <w:t>eBau</w:t>
-      </w:r>
-      <w:proofErr w:type="spellEnd"/>
-      <w:r>
-        <w:rPr>
-          <w:sz w:val="14"/>
-          <w:szCs w:val="14"/>
-        </w:rPr>
-        <w:t xml:space="preserve"> elektronisch zugänglich zu machen (vor Weiterleitung zur kantonalen Prüfung</w:t>
+        <w:t>Diese Akten sind vollständig (d.h. mit sämtlichen Bewilligungen, Korrespondenzen und Planunterlagen) in eBau elektronisch zugänglich zu machen (vor Weiterleitung zur kantonalen Prüfung</w:t>
       </w:r>
       <w:r>
         <w:rPr>
@@ -7893,204 +7735,6 @@
         </w:rPr>
         <w:t xml:space="preserve">   Nein, im kommunalen Archiv sind keine Akten vorhanden:</w:t>
       </w:r>
-    </w:p>
-    <w:p>
-      <w:pPr>
-        <w:keepNext/>
-        <w:spacing w:before="120" w:line="259" w:lineRule="auto"/>
-        <w:ind w:left="567"/>
-        <w:rPr>
-          <w:szCs w:val="20"/>
-        </w:rPr>
-      </w:pPr>
-      <w:r>
-        <w:rPr>
-          <w:szCs w:val="20"/>
-        </w:rPr>
-        <w:t>Für d</w:t>
-      </w:r>
-      <w:r>
-        <w:rPr>
-          <w:szCs w:val="20"/>
-        </w:rPr>
-        <w:t>ie örtliche Baubehörde</w:t>
-      </w:r>
-      <w:r>
-        <w:rPr>
-          <w:szCs w:val="20"/>
-        </w:rPr>
-        <w:t xml:space="preserve"> </w:t>
-      </w:r>
-      <w:r>
-        <w:rPr>
-          <w:szCs w:val="20"/>
-        </w:rPr>
-        <w:t xml:space="preserve">bestätigt, dass in ihrem Archiv </w:t>
-      </w:r>
-      <w:r>
-        <w:rPr>
-          <w:b/>
-          <w:bCs/>
-          <w:szCs w:val="20"/>
-        </w:rPr>
-        <w:t>keine</w:t>
-      </w:r>
-      <w:r>
-        <w:rPr>
-          <w:szCs w:val="20"/>
-        </w:rPr>
-        <w:t xml:space="preserve"> Archivakten vorhanden sind:</w:t>
-      </w:r>
-    </w:p>
-    <w:tbl>
-      <w:tblPr>
-        <w:tblStyle w:val="Tabellenraster"/>
-        <w:tblW w:w="8931" w:type="dxa"/>
-        <w:tblInd w:w="567" w:type="dxa"/>
-        <w:tblLook w:val="04A0" w:firstRow="1" w:lastRow="0" w:firstColumn="1" w:lastColumn="0" w:noHBand="0" w:noVBand="1"/>
-      </w:tblPr>
-      <w:tblGrid>
-        <w:gridCol w:w="851"/>
-        <w:gridCol w:w="2693"/>
-        <w:gridCol w:w="2126"/>
-        <w:gridCol w:w="3261"/>
-      </w:tblGrid>
-      <w:tr>
-        <w:tc>
-          <w:tcPr>
-            <w:tcW w:w="851" w:type="dxa"/>
-            <w:tcBorders>
-              <w:top w:val="nil"/>
-              <w:left w:val="nil"/>
-              <w:bottom w:val="nil"/>
-              <w:right w:val="nil"/>
-            </w:tcBorders>
-            <w:vAlign w:val="bottom"/>
-          </w:tcPr>
-          <w:p>
-            <w:pPr>
-              <w:widowControl/>
-              <w:spacing w:before="120" w:line="259" w:lineRule="auto"/>
-              <w:ind w:left="-110"/>
-              <w:rPr>
-                <w:szCs w:val="20"/>
-              </w:rPr>
-            </w:pPr>
-            <w:r>
-              <w:rPr>
-                <w:szCs w:val="20"/>
-              </w:rPr>
-              <w:t>Datum:</w:t>
-            </w:r>
-          </w:p>
-        </w:tc>
-        <w:tc>
-          <w:tcPr>
-            <w:tcW w:w="2693" w:type="dxa"/>
-            <w:tcBorders>
-              <w:top w:val="nil"/>
-              <w:left w:val="nil"/>
-              <w:bottom w:val="dotted" w:sz="4" w:space="0" w:color="auto"/>
-              <w:right w:val="nil"/>
-            </w:tcBorders>
-            <w:vAlign w:val="bottom"/>
-          </w:tcPr>
-          <w:p>
-            <w:pPr>
-              <w:widowControl/>
-              <w:spacing w:before="120" w:line="259" w:lineRule="auto"/>
-              <w:rPr>
-                <w:szCs w:val="20"/>
-              </w:rPr>
-            </w:pPr>
-            <w:proofErr w:type="gramStart"/>
-            <w:r>
-              <w:rPr>
-                <w:sz w:val="18"/>
-                <w:szCs w:val="18"/>
-              </w:rPr>
-              <w:t>{{ HEUTE</w:t>
-            </w:r>
-            <w:proofErr w:type="gramEnd"/>
-            <w:r>
-              <w:rPr>
-                <w:sz w:val="18"/>
-                <w:szCs w:val="18"/>
-              </w:rPr>
-              <w:t xml:space="preserve"> }}</w:t>
-            </w:r>
-          </w:p>
-        </w:tc>
-        <w:tc>
-          <w:tcPr>
-            <w:tcW w:w="2126" w:type="dxa"/>
-            <w:tcBorders>
-              <w:top w:val="nil"/>
-              <w:left w:val="nil"/>
-              <w:bottom w:val="nil"/>
-              <w:right w:val="nil"/>
-            </w:tcBorders>
-            <w:vAlign w:val="bottom"/>
-          </w:tcPr>
-          <w:p>
-            <w:pPr>
-              <w:widowControl/>
-              <w:spacing w:before="120" w:line="259" w:lineRule="auto"/>
-              <w:rPr>
-                <w:szCs w:val="20"/>
-              </w:rPr>
-            </w:pPr>
-            <w:r>
-              <w:rPr>
-                <w:szCs w:val="20"/>
-              </w:rPr>
-              <w:t xml:space="preserve">Stempel / </w:t>
-            </w:r>
-            <w:r>
-              <w:rPr>
-                <w:szCs w:val="20"/>
-              </w:rPr>
-              <w:br/>
-            </w:r>
-            <w:r>
-              <w:rPr>
-                <w:szCs w:val="20"/>
-              </w:rPr>
-              <w:t>Unterschrift:</w:t>
-            </w:r>
-          </w:p>
-        </w:tc>
-        <w:tc>
-          <w:tcPr>
-            <w:tcW w:w="3261" w:type="dxa"/>
-            <w:tcBorders>
-              <w:top w:val="nil"/>
-              <w:left w:val="nil"/>
-              <w:bottom w:val="dotted" w:sz="4" w:space="0" w:color="auto"/>
-              <w:right w:val="nil"/>
-            </w:tcBorders>
-          </w:tcPr>
-          <w:p>
-            <w:pPr>
-              <w:widowControl/>
-              <w:spacing w:before="120" w:line="259" w:lineRule="auto"/>
-              <w:rPr>
-                <w:szCs w:val="20"/>
-              </w:rPr>
-            </w:pPr>
-          </w:p>
-        </w:tc>
-      </w:tr>
-    </w:tbl>
-    <w:p>
-      <w:pPr>
-        <w:widowControl/>
-        <w:rPr>
-          <w:b/>
-          <w:sz w:val="14"/>
-          <w:szCs w:val="14"/>
-        </w:rPr>
-      </w:pPr>
     </w:p>
     <w:p>
       <w:pPr>
@@ -8287,6 +7931,7 @@
           <w:sz w:val="14"/>
           <w:szCs w:val="14"/>
         </w:rPr>
+        <w:lastRenderedPageBreak/>
         <w:t>Amt für Denkmalpflege und Archäologie</w:t>
       </w:r>
     </w:p>
@@ -8461,8 +8106,17 @@
           <w:sz w:val="14"/>
           <w:szCs w:val="14"/>
         </w:rPr>
-        <w:t>Stellen müssen durch die örtliche Baubehörde mit den Gesuchsunterlagen</w:t>
+        <w:t xml:space="preserve">Stellen müssen durch die örtliche Baubehörde mit den </w:t>
       </w:r>
+      <w:proofErr w:type="spellStart"/>
+      <w:r>
+        <w:rPr>
+          <w:sz w:val="14"/>
+          <w:szCs w:val="14"/>
+        </w:rPr>
+        <w:t>Gesuchsunterlagen</w:t>
+      </w:r>
+      <w:proofErr w:type="spellEnd"/>
       <w:r>
         <w:rPr>
           <w:sz w:val="14"/>
@@ -8603,7 +8257,7 @@
 </file>
 
 <file path=word/endnotes.xml><?xml version="1.0" encoding="utf-8"?>
-<w:endnotes xmlns:wpc="http://schemas.microsoft.com/office/word/2010/wordprocessingCanvas" xmlns:cx="http://schemas.microsoft.com/office/drawing/2014/chartex" xmlns:cx1="http://schemas.microsoft.com/office/drawing/2015/9/8/chartex" xmlns:cx2="http://schemas.microsoft.com/office/drawing/2015/10/21/chartex" xmlns:cx3="http://schemas.microsoft.com/office/drawing/2016/5/9/chartex" xmlns:cx4="http://schemas.microsoft.com/office/drawing/2016/5/10/chartex" xmlns:cx5="http://schemas.microsoft.com/office/drawing/2016/5/11/chartex" xmlns:cx6="http://schemas.microsoft.com/office/drawing/2016/5/12/chartex" xmlns:cx7="http://schemas.microsoft.com/office/drawing/2016/5/13/chartex" xmlns:cx8="http://schemas.microsoft.com/office/drawing/2016/5/14/chartex" xmlns:mc="http://schemas.openxmlformats.org/markup-compatibility/2006" xmlns:aink="http://schemas.microsoft.com/office/drawing/2016/ink" xmlns:am3d="http://schemas.microsoft.com/office/drawing/2017/model3d" xmlns:o="urn:schemas-microsoft-com:office:office" xmlns:oel="http://schemas.microsoft.com/office/2019/extlst" xmlns:r="http://schemas.openxmlformats.org/officeDocument/2006/relationships" xmlns:m="http://schemas.openxmlformats.org/officeDocument/2006/math" xmlns:v="urn:schemas-microsoft-com:vml" xmlns:wp14="http://schemas.microsoft.com/office/word/2010/wordprocessingDrawing" xmlns:wp="http://schemas.openxmlformats.org/drawingml/2006/wordprocessingDrawing" xmlns:w10="urn:schemas-microsoft-com:office:word" xmlns:w="http://schemas.openxmlformats.org/wordprocessingml/2006/main" xmlns:w14="http://schemas.microsoft.com/office/word/2010/wordml" xmlns:w15="http://schemas.microsoft.com/office/word/2012/wordml" xmlns:w16cex="http://schemas.microsoft.com/office/word/2018/wordml/cex" xmlns:w16cid="http://schemas.microsoft.com/office/word/2016/wordml/cid" xmlns:w16="http://schemas.microsoft.com/office/word/2018/wordml" xmlns:w16du="http://schemas.microsoft.com/office/word/2023/wordml/word16du" xmlns:w16sdtdh="http://schemas.microsoft.com/office/word/2020/wordml/sdtdatahash" xmlns:w16se="http://schemas.microsoft.com/office/word/2015/wordml/symex" xmlns:wpg="http://schemas.microsoft.com/office/word/2010/wordprocessingGroup" xmlns:wpi="http://schemas.microsoft.com/office/word/2010/wordprocessingInk" xmlns:wne="http://schemas.microsoft.com/office/word/2006/wordml" xmlns:wps="http://schemas.microsoft.com/office/word/2010/wordprocessingShape" mc:Ignorable="w14 w15 w16se w16cid w16 w16cex w16sdtdh w16du wp14">
+<w:endnotes xmlns:wpc="http://schemas.microsoft.com/office/word/2010/wordprocessingCanvas" xmlns:cx="http://schemas.microsoft.com/office/drawing/2014/chartex" xmlns:cx1="http://schemas.microsoft.com/office/drawing/2015/9/8/chartex" xmlns:cx2="http://schemas.microsoft.com/office/drawing/2015/10/21/chartex" xmlns:cx3="http://schemas.microsoft.com/office/drawing/2016/5/9/chartex" xmlns:cx4="http://schemas.microsoft.com/office/drawing/2016/5/10/chartex" xmlns:cx5="http://schemas.microsoft.com/office/drawing/2016/5/11/chartex" xmlns:cx6="http://schemas.microsoft.com/office/drawing/2016/5/12/chartex" xmlns:cx7="http://schemas.microsoft.com/office/drawing/2016/5/13/chartex" xmlns:cx8="http://schemas.microsoft.com/office/drawing/2016/5/14/chartex" xmlns:mc="http://schemas.openxmlformats.org/markup-compatibility/2006" xmlns:aink="http://schemas.microsoft.com/office/drawing/2016/ink" xmlns:am3d="http://schemas.microsoft.com/office/drawing/2017/model3d" xmlns:o="urn:schemas-microsoft-com:office:office" xmlns:oel="http://schemas.microsoft.com/office/2019/extlst" xmlns:r="http://schemas.openxmlformats.org/officeDocument/2006/relationships" xmlns:m="http://schemas.openxmlformats.org/officeDocument/2006/math" xmlns:v="urn:schemas-microsoft-com:vml" xmlns:wp14="http://schemas.microsoft.com/office/word/2010/wordprocessingDrawing" xmlns:wp="http://schemas.openxmlformats.org/drawingml/2006/wordprocessingDrawing" xmlns:w10="urn:schemas-microsoft-com:office:word" xmlns:w="http://schemas.openxmlformats.org/wordprocessingml/2006/main" xmlns:w14="http://schemas.microsoft.com/office/word/2010/wordml" xmlns:w15="http://schemas.microsoft.com/office/word/2012/wordml" xmlns:w16cex="http://schemas.microsoft.com/office/word/2018/wordml/cex" xmlns:w16cid="http://schemas.microsoft.com/office/word/2016/wordml/cid" xmlns:w16="http://schemas.microsoft.com/office/word/2018/wordml" xmlns:w16du="http://schemas.microsoft.com/office/word/2023/wordml/word16du" xmlns:w16sdtdh="http://schemas.microsoft.com/office/word/2020/wordml/sdtdatahash" xmlns:w16sdtfl="http://schemas.microsoft.com/office/word/2024/wordml/sdtformatlock" xmlns:w16se="http://schemas.microsoft.com/office/word/2015/wordml/symex" xmlns:wpg="http://schemas.microsoft.com/office/word/2010/wordprocessingGroup" xmlns:wpi="http://schemas.microsoft.com/office/word/2010/wordprocessingInk" xmlns:wne="http://schemas.microsoft.com/office/word/2006/wordml" xmlns:wps="http://schemas.microsoft.com/office/word/2010/wordprocessingShape" mc:Ignorable="w14 w15 w16se w16cid w16 w16cex w16sdtdh w16sdtfl w16du wp14">
   <w:endnote w:type="separator" w:id="-1">
     <w:p>
       <w:r>
@@ -8622,7 +8276,7 @@
 </file>
 
 <file path=word/footer1.xml><?xml version="1.0" encoding="utf-8"?>
-<w:ftr xmlns:wpc="http://schemas.microsoft.com/office/word/2010/wordprocessingCanvas" xmlns:cx="http://schemas.microsoft.com/office/drawing/2014/chartex" xmlns:cx1="http://schemas.microsoft.com/office/drawing/2015/9/8/chartex" xmlns:cx2="http://schemas.microsoft.com/office/drawing/2015/10/21/chartex" xmlns:cx3="http://schemas.microsoft.com/office/drawing/2016/5/9/chartex" xmlns:cx4="http://schemas.microsoft.com/office/drawing/2016/5/10/chartex" xmlns:cx5="http://schemas.microsoft.com/office/drawing/2016/5/11/chartex" xmlns:cx6="http://schemas.microsoft.com/office/drawing/2016/5/12/chartex" xmlns:cx7="http://schemas.microsoft.com/office/drawing/2016/5/13/chartex" xmlns:cx8="http://schemas.microsoft.com/office/drawing/2016/5/14/chartex" xmlns:mc="http://schemas.openxmlformats.org/markup-compatibility/2006" xmlns:aink="http://schemas.microsoft.com/office/drawing/2016/ink" xmlns:am3d="http://schemas.microsoft.com/office/drawing/2017/model3d" xmlns:o="urn:schemas-microsoft-com:office:office" xmlns:oel="http://schemas.microsoft.com/office/2019/extlst" xmlns:r="http://schemas.openxmlformats.org/officeDocument/2006/relationships" xmlns:m="http://schemas.openxmlformats.org/officeDocument/2006/math" xmlns:v="urn:schemas-microsoft-com:vml" xmlns:wp14="http://schemas.microsoft.com/office/word/2010/wordprocessingDrawing" xmlns:wp="http://schemas.openxmlformats.org/drawingml/2006/wordprocessingDrawing" xmlns:w10="urn:schemas-microsoft-com:office:word" xmlns:w="http://schemas.openxmlformats.org/wordprocessingml/2006/main" xmlns:w14="http://schemas.microsoft.com/office/word/2010/wordml" xmlns:w15="http://schemas.microsoft.com/office/word/2012/wordml" xmlns:w16cex="http://schemas.microsoft.com/office/word/2018/wordml/cex" xmlns:w16cid="http://schemas.microsoft.com/office/word/2016/wordml/cid" xmlns:w16="http://schemas.microsoft.com/office/word/2018/wordml" xmlns:w16du="http://schemas.microsoft.com/office/word/2023/wordml/word16du" xmlns:w16sdtdh="http://schemas.microsoft.com/office/word/2020/wordml/sdtdatahash" xmlns:w16se="http://schemas.microsoft.com/office/word/2015/wordml/symex" xmlns:wpg="http://schemas.microsoft.com/office/word/2010/wordprocessingGroup" xmlns:wpi="http://schemas.microsoft.com/office/word/2010/wordprocessingInk" xmlns:wne="http://schemas.microsoft.com/office/word/2006/wordml" xmlns:wps="http://schemas.microsoft.com/office/word/2010/wordprocessingShape" mc:Ignorable="w14 w15 w16se w16cid w16 w16cex w16sdtdh w16du wp14">
+<w:ftr xmlns:wpc="http://schemas.microsoft.com/office/word/2010/wordprocessingCanvas" xmlns:cx="http://schemas.microsoft.com/office/drawing/2014/chartex" xmlns:cx1="http://schemas.microsoft.com/office/drawing/2015/9/8/chartex" xmlns:cx2="http://schemas.microsoft.com/office/drawing/2015/10/21/chartex" xmlns:cx3="http://schemas.microsoft.com/office/drawing/2016/5/9/chartex" xmlns:cx4="http://schemas.microsoft.com/office/drawing/2016/5/10/chartex" xmlns:cx5="http://schemas.microsoft.com/office/drawing/2016/5/11/chartex" xmlns:cx6="http://schemas.microsoft.com/office/drawing/2016/5/12/chartex" xmlns:cx7="http://schemas.microsoft.com/office/drawing/2016/5/13/chartex" xmlns:cx8="http://schemas.microsoft.com/office/drawing/2016/5/14/chartex" xmlns:mc="http://schemas.openxmlformats.org/markup-compatibility/2006" xmlns:aink="http://schemas.microsoft.com/office/drawing/2016/ink" xmlns:am3d="http://schemas.microsoft.com/office/drawing/2017/model3d" xmlns:o="urn:schemas-microsoft-com:office:office" xmlns:oel="http://schemas.microsoft.com/office/2019/extlst" xmlns:r="http://schemas.openxmlformats.org/officeDocument/2006/relationships" xmlns:m="http://schemas.openxmlformats.org/officeDocument/2006/math" xmlns:v="urn:schemas-microsoft-com:vml" xmlns:wp14="http://schemas.microsoft.com/office/word/2010/wordprocessingDrawing" xmlns:wp="http://schemas.openxmlformats.org/drawingml/2006/wordprocessingDrawing" xmlns:w10="urn:schemas-microsoft-com:office:word" xmlns:w="http://schemas.openxmlformats.org/wordprocessingml/2006/main" xmlns:w14="http://schemas.microsoft.com/office/word/2010/wordml" xmlns:w15="http://schemas.microsoft.com/office/word/2012/wordml" xmlns:w16cex="http://schemas.microsoft.com/office/word/2018/wordml/cex" xmlns:w16cid="http://schemas.microsoft.com/office/word/2016/wordml/cid" xmlns:w16="http://schemas.microsoft.com/office/word/2018/wordml" xmlns:w16du="http://schemas.microsoft.com/office/word/2023/wordml/word16du" xmlns:w16sdtdh="http://schemas.microsoft.com/office/word/2020/wordml/sdtdatahash" xmlns:w16sdtfl="http://schemas.microsoft.com/office/word/2024/wordml/sdtformatlock" xmlns:w16se="http://schemas.microsoft.com/office/word/2015/wordml/symex" xmlns:wpg="http://schemas.microsoft.com/office/word/2010/wordprocessingGroup" xmlns:wpi="http://schemas.microsoft.com/office/word/2010/wordprocessingInk" xmlns:wne="http://schemas.microsoft.com/office/word/2006/wordml" xmlns:wps="http://schemas.microsoft.com/office/word/2010/wordprocessingShape" mc:Ignorable="w14 w15 w16se w16cid w16 w16cex w16sdtdh w16sdtfl w16du wp14">
   <w:p>
     <w:pPr>
       <w:pStyle w:val="Fuzeile"/>
@@ -8734,7 +8388,7 @@
 </file>
 
 <file path=word/footer2.xml><?xml version="1.0" encoding="utf-8"?>
-<w:ftr xmlns:wpc="http://schemas.microsoft.com/office/word/2010/wordprocessingCanvas" xmlns:cx="http://schemas.microsoft.com/office/drawing/2014/chartex" xmlns:cx1="http://schemas.microsoft.com/office/drawing/2015/9/8/chartex" xmlns:cx2="http://schemas.microsoft.com/office/drawing/2015/10/21/chartex" xmlns:cx3="http://schemas.microsoft.com/office/drawing/2016/5/9/chartex" xmlns:cx4="http://schemas.microsoft.com/office/drawing/2016/5/10/chartex" xmlns:cx5="http://schemas.microsoft.com/office/drawing/2016/5/11/chartex" xmlns:cx6="http://schemas.microsoft.com/office/drawing/2016/5/12/chartex" xmlns:cx7="http://schemas.microsoft.com/office/drawing/2016/5/13/chartex" xmlns:cx8="http://schemas.microsoft.com/office/drawing/2016/5/14/chartex" xmlns:mc="http://schemas.openxmlformats.org/markup-compatibility/2006" xmlns:aink="http://schemas.microsoft.com/office/drawing/2016/ink" xmlns:am3d="http://schemas.microsoft.com/office/drawing/2017/model3d" xmlns:o="urn:schemas-microsoft-com:office:office" xmlns:oel="http://schemas.microsoft.com/office/2019/extlst" xmlns:r="http://schemas.openxmlformats.org/officeDocument/2006/relationships" xmlns:m="http://schemas.openxmlformats.org/officeDocument/2006/math" xmlns:v="urn:schemas-microsoft-com:vml" xmlns:wp14="http://schemas.microsoft.com/office/word/2010/wordprocessingDrawing" xmlns:wp="http://schemas.openxmlformats.org/drawingml/2006/wordprocessingDrawing" xmlns:w10="urn:schemas-microsoft-com:office:word" xmlns:w="http://schemas.openxmlformats.org/wordprocessingml/2006/main" xmlns:w14="http://schemas.microsoft.com/office/word/2010/wordml" xmlns:w15="http://schemas.microsoft.com/office/word/2012/wordml" xmlns:w16cex="http://schemas.microsoft.com/office/word/2018/wordml/cex" xmlns:w16cid="http://schemas.microsoft.com/office/word/2016/wordml/cid" xmlns:w16="http://schemas.microsoft.com/office/word/2018/wordml" xmlns:w16du="http://schemas.microsoft.com/office/word/2023/wordml/word16du" xmlns:w16sdtdh="http://schemas.microsoft.com/office/word/2020/wordml/sdtdatahash" xmlns:w16se="http://schemas.microsoft.com/office/word/2015/wordml/symex" xmlns:wpg="http://schemas.microsoft.com/office/word/2010/wordprocessingGroup" xmlns:wpi="http://schemas.microsoft.com/office/word/2010/wordprocessingInk" xmlns:wne="http://schemas.microsoft.com/office/word/2006/wordml" xmlns:wps="http://schemas.microsoft.com/office/word/2010/wordprocessingShape" mc:Ignorable="w14 w15 w16se w16cid w16 w16cex w16sdtdh w16du wp14">
+<w:ftr xmlns:wpc="http://schemas.microsoft.com/office/word/2010/wordprocessingCanvas" xmlns:cx="http://schemas.microsoft.com/office/drawing/2014/chartex" xmlns:cx1="http://schemas.microsoft.com/office/drawing/2015/9/8/chartex" xmlns:cx2="http://schemas.microsoft.com/office/drawing/2015/10/21/chartex" xmlns:cx3="http://schemas.microsoft.com/office/drawing/2016/5/9/chartex" xmlns:cx4="http://schemas.microsoft.com/office/drawing/2016/5/10/chartex" xmlns:cx5="http://schemas.microsoft.com/office/drawing/2016/5/11/chartex" xmlns:cx6="http://schemas.microsoft.com/office/drawing/2016/5/12/chartex" xmlns:cx7="http://schemas.microsoft.com/office/drawing/2016/5/13/chartex" xmlns:cx8="http://schemas.microsoft.com/office/drawing/2016/5/14/chartex" xmlns:mc="http://schemas.openxmlformats.org/markup-compatibility/2006" xmlns:aink="http://schemas.microsoft.com/office/drawing/2016/ink" xmlns:am3d="http://schemas.microsoft.com/office/drawing/2017/model3d" xmlns:o="urn:schemas-microsoft-com:office:office" xmlns:oel="http://schemas.microsoft.com/office/2019/extlst" xmlns:r="http://schemas.openxmlformats.org/officeDocument/2006/relationships" xmlns:m="http://schemas.openxmlformats.org/officeDocument/2006/math" xmlns:v="urn:schemas-microsoft-com:vml" xmlns:wp14="http://schemas.microsoft.com/office/word/2010/wordprocessingDrawing" xmlns:wp="http://schemas.openxmlformats.org/drawingml/2006/wordprocessingDrawing" xmlns:w10="urn:schemas-microsoft-com:office:word" xmlns:w="http://schemas.openxmlformats.org/wordprocessingml/2006/main" xmlns:w14="http://schemas.microsoft.com/office/word/2010/wordml" xmlns:w15="http://schemas.microsoft.com/office/word/2012/wordml" xmlns:w16cex="http://schemas.microsoft.com/office/word/2018/wordml/cex" xmlns:w16cid="http://schemas.microsoft.com/office/word/2016/wordml/cid" xmlns:w16="http://schemas.microsoft.com/office/word/2018/wordml" xmlns:w16du="http://schemas.microsoft.com/office/word/2023/wordml/word16du" xmlns:w16sdtdh="http://schemas.microsoft.com/office/word/2020/wordml/sdtdatahash" xmlns:w16sdtfl="http://schemas.microsoft.com/office/word/2024/wordml/sdtformatlock" xmlns:w16se="http://schemas.microsoft.com/office/word/2015/wordml/symex" xmlns:wpg="http://schemas.microsoft.com/office/word/2010/wordprocessingGroup" xmlns:wpi="http://schemas.microsoft.com/office/word/2010/wordprocessingInk" xmlns:wne="http://schemas.microsoft.com/office/word/2006/wordml" xmlns:wps="http://schemas.microsoft.com/office/word/2010/wordprocessingShape" mc:Ignorable="w14 w15 w16se w16cid w16 w16cex w16sdtdh w16sdtfl w16du wp14">
   <w:p>
     <w:pPr>
       <w:pStyle w:val="Fuzeile"/>
@@ -8840,7 +8494,7 @@
 </file>
 
 <file path=word/footnotes.xml><?xml version="1.0" encoding="utf-8"?>
-<w:footnotes xmlns:wpc="http://schemas.microsoft.com/office/word/2010/wordprocessingCanvas" xmlns:cx="http://schemas.microsoft.com/office/drawing/2014/chartex" xmlns:cx1="http://schemas.microsoft.com/office/drawing/2015/9/8/chartex" xmlns:cx2="http://schemas.microsoft.com/office/drawing/2015/10/21/chartex" xmlns:cx3="http://schemas.microsoft.com/office/drawing/2016/5/9/chartex" xmlns:cx4="http://schemas.microsoft.com/office/drawing/2016/5/10/chartex" xmlns:cx5="http://schemas.microsoft.com/office/drawing/2016/5/11/chartex" xmlns:cx6="http://schemas.microsoft.com/office/drawing/2016/5/12/chartex" xmlns:cx7="http://schemas.microsoft.com/office/drawing/2016/5/13/chartex" xmlns:cx8="http://schemas.microsoft.com/office/drawing/2016/5/14/chartex" xmlns:mc="http://schemas.openxmlformats.org/markup-compatibility/2006" xmlns:aink="http://schemas.microsoft.com/office/drawing/2016/ink" xmlns:am3d="http://schemas.microsoft.com/office/drawing/2017/model3d" xmlns:o="urn:schemas-microsoft-com:office:office" xmlns:oel="http://schemas.microsoft.com/office/2019/extlst" xmlns:r="http://schemas.openxmlformats.org/officeDocument/2006/relationships" xmlns:m="http://schemas.openxmlformats.org/officeDocument/2006/math" xmlns:v="urn:schemas-microsoft-com:vml" xmlns:wp14="http://schemas.microsoft.com/office/word/2010/wordprocessingDrawing" xmlns:wp="http://schemas.openxmlformats.org/drawingml/2006/wordprocessingDrawing" xmlns:w10="urn:schemas-microsoft-com:office:word" xmlns:w="http://schemas.openxmlformats.org/wordprocessingml/2006/main" xmlns:w14="http://schemas.microsoft.com/office/word/2010/wordml" xmlns:w15="http://schemas.microsoft.com/office/word/2012/wordml" xmlns:w16cex="http://schemas.microsoft.com/office/word/2018/wordml/cex" xmlns:w16cid="http://schemas.microsoft.com/office/word/2016/wordml/cid" xmlns:w16="http://schemas.microsoft.com/office/word/2018/wordml" xmlns:w16du="http://schemas.microsoft.com/office/word/2023/wordml/word16du" xmlns:w16sdtdh="http://schemas.microsoft.com/office/word/2020/wordml/sdtdatahash" xmlns:w16se="http://schemas.microsoft.com/office/word/2015/wordml/symex" xmlns:wpg="http://schemas.microsoft.com/office/word/2010/wordprocessingGroup" xmlns:wpi="http://schemas.microsoft.com/office/word/2010/wordprocessingInk" xmlns:wne="http://schemas.microsoft.com/office/word/2006/wordml" xmlns:wps="http://schemas.microsoft.com/office/word/2010/wordprocessingShape" mc:Ignorable="w14 w15 w16se w16cid w16 w16cex w16sdtdh w16du wp14">
+<w:footnotes xmlns:wpc="http://schemas.microsoft.com/office/word/2010/wordprocessingCanvas" xmlns:cx="http://schemas.microsoft.com/office/drawing/2014/chartex" xmlns:cx1="http://schemas.microsoft.com/office/drawing/2015/9/8/chartex" xmlns:cx2="http://schemas.microsoft.com/office/drawing/2015/10/21/chartex" xmlns:cx3="http://schemas.microsoft.com/office/drawing/2016/5/9/chartex" xmlns:cx4="http://schemas.microsoft.com/office/drawing/2016/5/10/chartex" xmlns:cx5="http://schemas.microsoft.com/office/drawing/2016/5/11/chartex" xmlns:cx6="http://schemas.microsoft.com/office/drawing/2016/5/12/chartex" xmlns:cx7="http://schemas.microsoft.com/office/drawing/2016/5/13/chartex" xmlns:cx8="http://schemas.microsoft.com/office/drawing/2016/5/14/chartex" xmlns:mc="http://schemas.openxmlformats.org/markup-compatibility/2006" xmlns:aink="http://schemas.microsoft.com/office/drawing/2016/ink" xmlns:am3d="http://schemas.microsoft.com/office/drawing/2017/model3d" xmlns:o="urn:schemas-microsoft-com:office:office" xmlns:oel="http://schemas.microsoft.com/office/2019/extlst" xmlns:r="http://schemas.openxmlformats.org/officeDocument/2006/relationships" xmlns:m="http://schemas.openxmlformats.org/officeDocument/2006/math" xmlns:v="urn:schemas-microsoft-com:vml" xmlns:wp14="http://schemas.microsoft.com/office/word/2010/wordprocessingDrawing" xmlns:wp="http://schemas.openxmlformats.org/drawingml/2006/wordprocessingDrawing" xmlns:w10="urn:schemas-microsoft-com:office:word" xmlns:w="http://schemas.openxmlformats.org/wordprocessingml/2006/main" xmlns:w14="http://schemas.microsoft.com/office/word/2010/wordml" xmlns:w15="http://schemas.microsoft.com/office/word/2012/wordml" xmlns:w16cex="http://schemas.microsoft.com/office/word/2018/wordml/cex" xmlns:w16cid="http://schemas.microsoft.com/office/word/2016/wordml/cid" xmlns:w16="http://schemas.microsoft.com/office/word/2018/wordml" xmlns:w16du="http://schemas.microsoft.com/office/word/2023/wordml/word16du" xmlns:w16sdtdh="http://schemas.microsoft.com/office/word/2020/wordml/sdtdatahash" xmlns:w16sdtfl="http://schemas.microsoft.com/office/word/2024/wordml/sdtformatlock" xmlns:w16se="http://schemas.microsoft.com/office/word/2015/wordml/symex" xmlns:wpg="http://schemas.microsoft.com/office/word/2010/wordprocessingGroup" xmlns:wpi="http://schemas.microsoft.com/office/word/2010/wordprocessingInk" xmlns:wne="http://schemas.microsoft.com/office/word/2006/wordml" xmlns:wps="http://schemas.microsoft.com/office/word/2010/wordprocessingShape" mc:Ignorable="w14 w15 w16se w16cid w16 w16cex w16sdtdh w16sdtfl w16du wp14">
   <w:footnote w:type="separator" w:id="-1">
     <w:p>
       <w:r>
@@ -8859,7 +8513,7 @@
 </file>
 
 <file path=word/header1.xml><?xml version="1.0" encoding="utf-8"?>
-<w:hdr xmlns:wpc="http://schemas.microsoft.com/office/word/2010/wordprocessingCanvas" xmlns:cx="http://schemas.microsoft.com/office/drawing/2014/chartex" xmlns:cx1="http://schemas.microsoft.com/office/drawing/2015/9/8/chartex" xmlns:cx2="http://schemas.microsoft.com/office/drawing/2015/10/21/chartex" xmlns:cx3="http://schemas.microsoft.com/office/drawing/2016/5/9/chartex" xmlns:cx4="http://schemas.microsoft.com/office/drawing/2016/5/10/chartex" xmlns:cx5="http://schemas.microsoft.com/office/drawing/2016/5/11/chartex" xmlns:cx6="http://schemas.microsoft.com/office/drawing/2016/5/12/chartex" xmlns:cx7="http://schemas.microsoft.com/office/drawing/2016/5/13/chartex" xmlns:cx8="http://schemas.microsoft.com/office/drawing/2016/5/14/chartex" xmlns:mc="http://schemas.openxmlformats.org/markup-compatibility/2006" xmlns:aink="http://schemas.microsoft.com/office/drawing/2016/ink" xmlns:am3d="http://schemas.microsoft.com/office/drawing/2017/model3d" xmlns:o="urn:schemas-microsoft-com:office:office" xmlns:oel="http://schemas.microsoft.com/office/2019/extlst" xmlns:r="http://schemas.openxmlformats.org/officeDocument/2006/relationships" xmlns:m="http://schemas.openxmlformats.org/officeDocument/2006/math" xmlns:v="urn:schemas-microsoft-com:vml" xmlns:wp14="http://schemas.microsoft.com/office/word/2010/wordprocessingDrawing" xmlns:wp="http://schemas.openxmlformats.org/drawingml/2006/wordprocessingDrawing" xmlns:w10="urn:schemas-microsoft-com:office:word" xmlns:w="http://schemas.openxmlformats.org/wordprocessingml/2006/main" xmlns:w14="http://schemas.microsoft.com/office/word/2010/wordml" xmlns:w15="http://schemas.microsoft.com/office/word/2012/wordml" xmlns:w16cex="http://schemas.microsoft.com/office/word/2018/wordml/cex" xmlns:w16cid="http://schemas.microsoft.com/office/word/2016/wordml/cid" xmlns:w16="http://schemas.microsoft.com/office/word/2018/wordml" xmlns:w16du="http://schemas.microsoft.com/office/word/2023/wordml/word16du" xmlns:w16sdtdh="http://schemas.microsoft.com/office/word/2020/wordml/sdtdatahash" xmlns:w16se="http://schemas.microsoft.com/office/word/2015/wordml/symex" xmlns:wpg="http://schemas.microsoft.com/office/word/2010/wordprocessingGroup" xmlns:wpi="http://schemas.microsoft.com/office/word/2010/wordprocessingInk" xmlns:wne="http://schemas.microsoft.com/office/word/2006/wordml" xmlns:wps="http://schemas.microsoft.com/office/word/2010/wordprocessingShape" mc:Ignorable="w14 w15 w16se w16cid w16 w16cex w16sdtdh w16du wp14">
+<w:hdr xmlns:wpc="http://schemas.microsoft.com/office/word/2010/wordprocessingCanvas" xmlns:cx="http://schemas.microsoft.com/office/drawing/2014/chartex" xmlns:cx1="http://schemas.microsoft.com/office/drawing/2015/9/8/chartex" xmlns:cx2="http://schemas.microsoft.com/office/drawing/2015/10/21/chartex" xmlns:cx3="http://schemas.microsoft.com/office/drawing/2016/5/9/chartex" xmlns:cx4="http://schemas.microsoft.com/office/drawing/2016/5/10/chartex" xmlns:cx5="http://schemas.microsoft.com/office/drawing/2016/5/11/chartex" xmlns:cx6="http://schemas.microsoft.com/office/drawing/2016/5/12/chartex" xmlns:cx7="http://schemas.microsoft.com/office/drawing/2016/5/13/chartex" xmlns:cx8="http://schemas.microsoft.com/office/drawing/2016/5/14/chartex" xmlns:mc="http://schemas.openxmlformats.org/markup-compatibility/2006" xmlns:aink="http://schemas.microsoft.com/office/drawing/2016/ink" xmlns:am3d="http://schemas.microsoft.com/office/drawing/2017/model3d" xmlns:o="urn:schemas-microsoft-com:office:office" xmlns:oel="http://schemas.microsoft.com/office/2019/extlst" xmlns:r="http://schemas.openxmlformats.org/officeDocument/2006/relationships" xmlns:m="http://schemas.openxmlformats.org/officeDocument/2006/math" xmlns:v="urn:schemas-microsoft-com:vml" xmlns:wp14="http://schemas.microsoft.com/office/word/2010/wordprocessingDrawing" xmlns:wp="http://schemas.openxmlformats.org/drawingml/2006/wordprocessingDrawing" xmlns:w10="urn:schemas-microsoft-com:office:word" xmlns:w="http://schemas.openxmlformats.org/wordprocessingml/2006/main" xmlns:w14="http://schemas.microsoft.com/office/word/2010/wordml" xmlns:w15="http://schemas.microsoft.com/office/word/2012/wordml" xmlns:w16cex="http://schemas.microsoft.com/office/word/2018/wordml/cex" xmlns:w16cid="http://schemas.microsoft.com/office/word/2016/wordml/cid" xmlns:w16="http://schemas.microsoft.com/office/word/2018/wordml" xmlns:w16du="http://schemas.microsoft.com/office/word/2023/wordml/word16du" xmlns:w16sdtdh="http://schemas.microsoft.com/office/word/2020/wordml/sdtdatahash" xmlns:w16sdtfl="http://schemas.microsoft.com/office/word/2024/wordml/sdtformatlock" xmlns:w16se="http://schemas.microsoft.com/office/word/2015/wordml/symex" xmlns:wpg="http://schemas.microsoft.com/office/word/2010/wordprocessingGroup" xmlns:wpi="http://schemas.microsoft.com/office/word/2010/wordprocessingInk" xmlns:wne="http://schemas.microsoft.com/office/word/2006/wordml" xmlns:wps="http://schemas.microsoft.com/office/word/2010/wordprocessingShape" mc:Ignorable="w14 w15 w16se w16cid w16 w16cex w16sdtdh w16sdtfl w16du wp14">
   <w:p>
     <w:pPr>
       <w:pStyle w:val="Kopfzeile"/>
@@ -8926,7 +8580,7 @@
 </file>
 
 <file path=word/header2.xml><?xml version="1.0" encoding="utf-8"?>
-<w:hdr xmlns:wpc="http://schemas.microsoft.com/office/word/2010/wordprocessingCanvas" xmlns:cx="http://schemas.microsoft.com/office/drawing/2014/chartex" xmlns:cx1="http://schemas.microsoft.com/office/drawing/2015/9/8/chartex" xmlns:cx2="http://schemas.microsoft.com/office/drawing/2015/10/21/chartex" xmlns:cx3="http://schemas.microsoft.com/office/drawing/2016/5/9/chartex" xmlns:cx4="http://schemas.microsoft.com/office/drawing/2016/5/10/chartex" xmlns:cx5="http://schemas.microsoft.com/office/drawing/2016/5/11/chartex" xmlns:cx6="http://schemas.microsoft.com/office/drawing/2016/5/12/chartex" xmlns:cx7="http://schemas.microsoft.com/office/drawing/2016/5/13/chartex" xmlns:cx8="http://schemas.microsoft.com/office/drawing/2016/5/14/chartex" xmlns:mc="http://schemas.openxmlformats.org/markup-compatibility/2006" xmlns:aink="http://schemas.microsoft.com/office/drawing/2016/ink" xmlns:am3d="http://schemas.microsoft.com/office/drawing/2017/model3d" xmlns:o="urn:schemas-microsoft-com:office:office" xmlns:oel="http://schemas.microsoft.com/office/2019/extlst" xmlns:r="http://schemas.openxmlformats.org/officeDocument/2006/relationships" xmlns:m="http://schemas.openxmlformats.org/officeDocument/2006/math" xmlns:v="urn:schemas-microsoft-com:vml" xmlns:wp14="http://schemas.microsoft.com/office/word/2010/wordprocessingDrawing" xmlns:wp="http://schemas.openxmlformats.org/drawingml/2006/wordprocessingDrawing" xmlns:w10="urn:schemas-microsoft-com:office:word" xmlns:w="http://schemas.openxmlformats.org/wordprocessingml/2006/main" xmlns:w14="http://schemas.microsoft.com/office/word/2010/wordml" xmlns:w15="http://schemas.microsoft.com/office/word/2012/wordml" xmlns:w16cex="http://schemas.microsoft.com/office/word/2018/wordml/cex" xmlns:w16cid="http://schemas.microsoft.com/office/word/2016/wordml/cid" xmlns:w16="http://schemas.microsoft.com/office/word/2018/wordml" xmlns:w16du="http://schemas.microsoft.com/office/word/2023/wordml/word16du" xmlns:w16sdtdh="http://schemas.microsoft.com/office/word/2020/wordml/sdtdatahash" xmlns:w16se="http://schemas.microsoft.com/office/word/2015/wordml/symex" xmlns:wpg="http://schemas.microsoft.com/office/word/2010/wordprocessingGroup" xmlns:wpi="http://schemas.microsoft.com/office/word/2010/wordprocessingInk" xmlns:wne="http://schemas.microsoft.com/office/word/2006/wordml" xmlns:wps="http://schemas.microsoft.com/office/word/2010/wordprocessingShape" mc:Ignorable="w14 w15 w16se w16cid w16 w16cex w16sdtdh w16du wp14">
+<w:hdr xmlns:wpc="http://schemas.microsoft.com/office/word/2010/wordprocessingCanvas" xmlns:cx="http://schemas.microsoft.com/office/drawing/2014/chartex" xmlns:cx1="http://schemas.microsoft.com/office/drawing/2015/9/8/chartex" xmlns:cx2="http://schemas.microsoft.com/office/drawing/2015/10/21/chartex" xmlns:cx3="http://schemas.microsoft.com/office/drawing/2016/5/9/chartex" xmlns:cx4="http://schemas.microsoft.com/office/drawing/2016/5/10/chartex" xmlns:cx5="http://schemas.microsoft.com/office/drawing/2016/5/11/chartex" xmlns:cx6="http://schemas.microsoft.com/office/drawing/2016/5/12/chartex" xmlns:cx7="http://schemas.microsoft.com/office/drawing/2016/5/13/chartex" xmlns:cx8="http://schemas.microsoft.com/office/drawing/2016/5/14/chartex" xmlns:mc="http://schemas.openxmlformats.org/markup-compatibility/2006" xmlns:aink="http://schemas.microsoft.com/office/drawing/2016/ink" xmlns:am3d="http://schemas.microsoft.com/office/drawing/2017/model3d" xmlns:o="urn:schemas-microsoft-com:office:office" xmlns:oel="http://schemas.microsoft.com/office/2019/extlst" xmlns:r="http://schemas.openxmlformats.org/officeDocument/2006/relationships" xmlns:m="http://schemas.openxmlformats.org/officeDocument/2006/math" xmlns:v="urn:schemas-microsoft-com:vml" xmlns:wp14="http://schemas.microsoft.com/office/word/2010/wordprocessingDrawing" xmlns:wp="http://schemas.openxmlformats.org/drawingml/2006/wordprocessingDrawing" xmlns:w10="urn:schemas-microsoft-com:office:word" xmlns:w="http://schemas.openxmlformats.org/wordprocessingml/2006/main" xmlns:w14="http://schemas.microsoft.com/office/word/2010/wordml" xmlns:w15="http://schemas.microsoft.com/office/word/2012/wordml" xmlns:w16cex="http://schemas.microsoft.com/office/word/2018/wordml/cex" xmlns:w16cid="http://schemas.microsoft.com/office/word/2016/wordml/cid" xmlns:w16="http://schemas.microsoft.com/office/word/2018/wordml" xmlns:w16du="http://schemas.microsoft.com/office/word/2023/wordml/word16du" xmlns:w16sdtdh="http://schemas.microsoft.com/office/word/2020/wordml/sdtdatahash" xmlns:w16sdtfl="http://schemas.microsoft.com/office/word/2024/wordml/sdtformatlock" xmlns:w16se="http://schemas.microsoft.com/office/word/2015/wordml/symex" xmlns:wpg="http://schemas.microsoft.com/office/word/2010/wordprocessingGroup" xmlns:wpi="http://schemas.microsoft.com/office/word/2010/wordprocessingInk" xmlns:wne="http://schemas.microsoft.com/office/word/2006/wordml" xmlns:wps="http://schemas.microsoft.com/office/word/2010/wordprocessingShape" mc:Ignorable="w14 w15 w16se w16cid w16 w16cex w16sdtdh w16sdtfl w16du wp14">
   <w:p>
     <w:pPr>
       <w:widowControl/>
@@ -9183,7 +8837,7 @@
 </file>
 
 <file path=word/numbering.xml><?xml version="1.0" encoding="utf-8"?>
-<w:numbering xmlns:wpc="http://schemas.microsoft.com/office/word/2010/wordprocessingCanvas" xmlns:cx="http://schemas.microsoft.com/office/drawing/2014/chartex" xmlns:cx1="http://schemas.microsoft.com/office/drawing/2015/9/8/chartex" xmlns:cx2="http://schemas.microsoft.com/office/drawing/2015/10/21/chartex" xmlns:cx3="http://schemas.microsoft.com/office/drawing/2016/5/9/chartex" xmlns:cx4="http://schemas.microsoft.com/office/drawing/2016/5/10/chartex" xmlns:cx5="http://schemas.microsoft.com/office/drawing/2016/5/11/chartex" xmlns:cx6="http://schemas.microsoft.com/office/drawing/2016/5/12/chartex" xmlns:cx7="http://schemas.microsoft.com/office/drawing/2016/5/13/chartex" xmlns:cx8="http://schemas.microsoft.com/office/drawing/2016/5/14/chartex" xmlns:mc="http://schemas.openxmlformats.org/markup-compatibility/2006" xmlns:aink="http://schemas.microsoft.com/office/drawing/2016/ink" xmlns:am3d="http://schemas.microsoft.com/office/drawing/2017/model3d" xmlns:o="urn:schemas-microsoft-com:office:office" xmlns:oel="http://schemas.microsoft.com/office/2019/extlst" xmlns:r="http://schemas.openxmlformats.org/officeDocument/2006/relationships" xmlns:m="http://schemas.openxmlformats.org/officeDocument/2006/math" xmlns:v="urn:schemas-microsoft-com:vml" xmlns:wp14="http://schemas.microsoft.com/office/word/2010/wordprocessingDrawing" xmlns:wp="http://schemas.openxmlformats.org/drawingml/2006/wordprocessingDrawing" xmlns:w10="urn:schemas-microsoft-com:office:word" xmlns:w="http://schemas.openxmlformats.org/wordprocessingml/2006/main" xmlns:w14="http://schemas.microsoft.com/office/word/2010/wordml" xmlns:w15="http://schemas.microsoft.com/office/word/2012/wordml" xmlns:w16cex="http://schemas.microsoft.com/office/word/2018/wordml/cex" xmlns:w16cid="http://schemas.microsoft.com/office/word/2016/wordml/cid" xmlns:w16="http://schemas.microsoft.com/office/word/2018/wordml" xmlns:w16du="http://schemas.microsoft.com/office/word/2023/wordml/word16du" xmlns:w16sdtdh="http://schemas.microsoft.com/office/word/2020/wordml/sdtdatahash" xmlns:w16se="http://schemas.microsoft.com/office/word/2015/wordml/symex" xmlns:wpg="http://schemas.microsoft.com/office/word/2010/wordprocessingGroup" xmlns:wpi="http://schemas.microsoft.com/office/word/2010/wordprocessingInk" xmlns:wne="http://schemas.microsoft.com/office/word/2006/wordml" xmlns:wps="http://schemas.microsoft.com/office/word/2010/wordprocessingShape" mc:Ignorable="w14 w15 w16se w16cid w16 w16cex w16sdtdh w16du wp14">
+<w:numbering xmlns:wpc="http://schemas.microsoft.com/office/word/2010/wordprocessingCanvas" xmlns:cx="http://schemas.microsoft.com/office/drawing/2014/chartex" xmlns:cx1="http://schemas.microsoft.com/office/drawing/2015/9/8/chartex" xmlns:cx2="http://schemas.microsoft.com/office/drawing/2015/10/21/chartex" xmlns:cx3="http://schemas.microsoft.com/office/drawing/2016/5/9/chartex" xmlns:cx4="http://schemas.microsoft.com/office/drawing/2016/5/10/chartex" xmlns:cx5="http://schemas.microsoft.com/office/drawing/2016/5/11/chartex" xmlns:cx6="http://schemas.microsoft.com/office/drawing/2016/5/12/chartex" xmlns:cx7="http://schemas.microsoft.com/office/drawing/2016/5/13/chartex" xmlns:cx8="http://schemas.microsoft.com/office/drawing/2016/5/14/chartex" xmlns:mc="http://schemas.openxmlformats.org/markup-compatibility/2006" xmlns:aink="http://schemas.microsoft.com/office/drawing/2016/ink" xmlns:am3d="http://schemas.microsoft.com/office/drawing/2017/model3d" xmlns:o="urn:schemas-microsoft-com:office:office" xmlns:oel="http://schemas.microsoft.com/office/2019/extlst" xmlns:r="http://schemas.openxmlformats.org/officeDocument/2006/relationships" xmlns:m="http://schemas.openxmlformats.org/officeDocument/2006/math" xmlns:v="urn:schemas-microsoft-com:vml" xmlns:wp14="http://schemas.microsoft.com/office/word/2010/wordprocessingDrawing" xmlns:wp="http://schemas.openxmlformats.org/drawingml/2006/wordprocessingDrawing" xmlns:w10="urn:schemas-microsoft-com:office:word" xmlns:w="http://schemas.openxmlformats.org/wordprocessingml/2006/main" xmlns:w14="http://schemas.microsoft.com/office/word/2010/wordml" xmlns:w15="http://schemas.microsoft.com/office/word/2012/wordml" xmlns:w16cex="http://schemas.microsoft.com/office/word/2018/wordml/cex" xmlns:w16cid="http://schemas.microsoft.com/office/word/2016/wordml/cid" xmlns:w16="http://schemas.microsoft.com/office/word/2018/wordml" xmlns:w16du="http://schemas.microsoft.com/office/word/2023/wordml/word16du" xmlns:w16sdtdh="http://schemas.microsoft.com/office/word/2020/wordml/sdtdatahash" xmlns:w16sdtfl="http://schemas.microsoft.com/office/word/2024/wordml/sdtformatlock" xmlns:w16se="http://schemas.microsoft.com/office/word/2015/wordml/symex" xmlns:wpg="http://schemas.microsoft.com/office/word/2010/wordprocessingGroup" xmlns:wpi="http://schemas.microsoft.com/office/word/2010/wordprocessingInk" xmlns:wne="http://schemas.microsoft.com/office/word/2006/wordml" xmlns:wps="http://schemas.microsoft.com/office/word/2010/wordprocessingShape" mc:Ignorable="w14 w15 w16se w16cid w16 w16cex w16sdtdh w16sdtfl w16du wp14">
   <w:abstractNum w:abstractNumId="0" w15:restartNumberingAfterBreak="0">
     <w:nsid w:val="FFFFFF7C"/>
     <w:multiLevelType w:val="singleLevel"/>
@@ -12976,7 +12630,7 @@
 </file>
 
 <file path=word/styles.xml><?xml version="1.0" encoding="utf-8"?>
-<w:styles xmlns:mc="http://schemas.openxmlformats.org/markup-compatibility/2006" xmlns:r="http://schemas.openxmlformats.org/officeDocument/2006/relationships" xmlns:w="http://schemas.openxmlformats.org/wordprocessingml/2006/main" xmlns:w14="http://schemas.microsoft.com/office/word/2010/wordml" xmlns:w15="http://schemas.microsoft.com/office/word/2012/wordml" xmlns:w16cex="http://schemas.microsoft.com/office/word/2018/wordml/cex" xmlns:w16cid="http://schemas.microsoft.com/office/word/2016/wordml/cid" xmlns:w16="http://schemas.microsoft.com/office/word/2018/wordml" xmlns:w16du="http://schemas.microsoft.com/office/word/2023/wordml/word16du" xmlns:w16sdtdh="http://schemas.microsoft.com/office/word/2020/wordml/sdtdatahash" xmlns:w16se="http://schemas.microsoft.com/office/word/2015/wordml/symex" mc:Ignorable="w14 w15 w16se w16cid w16 w16cex w16sdtdh w16du">
+<w:styles xmlns:mc="http://schemas.openxmlformats.org/markup-compatibility/2006" xmlns:r="http://schemas.openxmlformats.org/officeDocument/2006/relationships" xmlns:w="http://schemas.openxmlformats.org/wordprocessingml/2006/main" xmlns:w14="http://schemas.microsoft.com/office/word/2010/wordml" xmlns:w15="http://schemas.microsoft.com/office/word/2012/wordml" xmlns:w16cex="http://schemas.microsoft.com/office/word/2018/wordml/cex" xmlns:w16cid="http://schemas.microsoft.com/office/word/2016/wordml/cid" xmlns:w16="http://schemas.microsoft.com/office/word/2018/wordml" xmlns:w16du="http://schemas.microsoft.com/office/word/2023/wordml/word16du" xmlns:w16sdtdh="http://schemas.microsoft.com/office/word/2020/wordml/sdtdatahash" xmlns:w16sdtfl="http://schemas.microsoft.com/office/word/2024/wordml/sdtformatlock" xmlns:w16se="http://schemas.microsoft.com/office/word/2015/wordml/symex" mc:Ignorable="w14 w15 w16se w16cid w16 w16cex w16sdtdh w16sdtfl w16du">
   <w:docDefaults>
     <w:rPrDefault>
       <w:rPr>

</xml_diff>